<commit_message>
Remove redundant "Approved by the Audit Committee" line from Non-Audit Services Policy
Request 6221b053 (issue 50): Marianne's annotation on p.3 asked to
delete the standalone closing sentence "Approved by the Audit
Committee." — the digital Owner/Approver card already carries this,
per the template's "no board signatures page" convention.

- policies/sources/Non_audit_Service_Policy.docx: delete the paragraph
  (last one in the document, right after the Governance section body
  text).

Verified: diffed the regenerated PDFs against HEAD and confirmed the
only change is that one sentence disappearing (page count unchanged,
nothing else moved); self-review passes (19/19 remaining source
passages found, only the pre-existing blank approval_date flagged for
attention).

Co-Authored-By: Claude Sonnet 5 <noreply@anthropic.com>
Claude-Session: https://claude.ai/code/session_01VUsjveqB5rJTNZAuQyZqE6
</commit_message>
<xml_diff>
--- a/docs/files/Non_Audit_Services_Policy__Policy_2026-09.docx
+++ b/docs/files/Non_Audit_Services_Policy__Policy_2026-09.docx
@@ -19,7 +19,7 @@
               <a:graphicData uri="http://schemas.openxmlformats.org/drawingml/2006/picture">
                 <pic:pic>
                   <pic:nvPicPr>
-                    <pic:cNvPr id="0" name="tmpbozhynro.png"/>
+                    <pic:cNvPr id="0" name="tmpnxsh2pts.png"/>
                     <pic:cNvPicPr/>
                   </pic:nvPicPr>
                   <pic:blipFill>
@@ -420,22 +420,6 @@
         <w:t>Governance and oversight of our NAS commitments are embedded across BioMar's operations. This policy is owned by Group Finance, with day-to-day implementation supported by local finance teams across all BioMar entities.</w:t>
       </w:r>
     </w:p>
-    <w:p>
-      <w:pPr>
-        <w:spacing w:after="200"/>
-        <w:jc w:val="both"/>
-      </w:pPr>
-      <w:r>
-        <w:rPr>
-          <w:rFonts w:ascii="Avenir Next LT Pro" w:hAnsi="Avenir Next LT Pro"/>
-          <w:b w:val="0"/>
-          <w:i w:val="0"/>
-          <w:color w:val="1C4076"/>
-          <w:sz w:val="22"/>
-        </w:rPr>
-        <w:t>Approved by the Audit Committee.</w:t>
-      </w:r>
-    </w:p>
     <w:sectPr>
       <w:headerReference w:type="default" r:id="rId10"/>
       <w:footerReference w:type="default" r:id="rId11"/>

</xml_diff>